<commit_message>
added speed as ability
</commit_message>
<xml_diff>
--- a/Dokumentacja.docx
+++ b/Dokumentacja.docx
@@ -1639,7 +1639,7 @@
           <w:sz w:val="24"/>
           <w:sz-cs w:val="24"/>
         </w:rPr>
-        <w:t xml:space="preserve">Pracownicy mogą sabotować innych, żartowniś robi pralki, gadatek doprowadza plotki, technik hakuje konto, pracownicy mogą się bić, </w:t>
+        <w:t xml:space="preserve">Pracownicy mogą sabotować innych, żartowniś robi pranki, gadatek doprowadza plotki, technik hakuje konto, pracownicy mogą się bić, </w:t>
       </w:r>
     </w:p>
     <w:p>
@@ -1761,6 +1761,134 @@
           <w:sz-cs w:val="24"/>
         </w:rPr>
         <w:t xml:space="preserve">Np. Pracownik A to żartowniś (8/10) pracownik B to nudziarz (2/10)</w:t>
+      </w:r>
+    </w:p>
+    <w:p>
+      <w:pPr/>
+      <w:r>
+        <w:rPr>
+          <w:rFonts w:ascii="Times" w:hAnsi="Times" w:cs="Times"/>
+          <w:sz w:val="24"/>
+          <w:sz-cs w:val="24"/>
+        </w:rPr>
+        <w:t xml:space="preserve"/>
+      </w:r>
+    </w:p>
+    <w:p>
+      <w:pPr/>
+      <w:r>
+        <w:rPr>
+          <w:rFonts w:ascii="Times" w:hAnsi="Times" w:cs="Times"/>
+          <w:sz w:val="24"/>
+          <w:sz-cs w:val="24"/>
+          <w:b/>
+        </w:rPr>
+        <w:t xml:space="preserve">Jak gracz może rozwiązywać problemy z relacjami?</w:t>
+      </w:r>
+      <w:r>
+        <w:rPr>
+          <w:rFonts w:ascii="Times" w:hAnsi="Times" w:cs="Times"/>
+          <w:sz w:val="24"/>
+          <w:sz-cs w:val="24"/>
+        </w:rPr>
+        <w:t xml:space="preserve"/>
+      </w:r>
+    </w:p>
+    <w:p>
+      <w:pPr/>
+      <w:r>
+        <w:rPr>
+          <w:rFonts w:ascii="Times" w:hAnsi="Times" w:cs="Times"/>
+          <w:sz w:val="24"/>
+          <w:sz-cs w:val="24"/>
+        </w:rPr>
+        <w:t xml:space="preserve"/>
+      </w:r>
+    </w:p>
+    <w:p>
+      <w:pPr/>
+      <w:r>
+        <w:rPr>
+          <w:rFonts w:ascii="Times" w:hAnsi="Times" w:cs="Times"/>
+          <w:sz w:val="24"/>
+          <w:sz-cs w:val="24"/>
+        </w:rPr>
+        <w:t xml:space="preserve">Wprowadzić ograniczone piętra/sterfy (pracownik A może pracować tylko w strefie A, pracownik B tylko w strefie B, albo pracownik A ma zakaz wchodzenia tylko do strefy B i vice versa)</w:t>
+      </w:r>
+    </w:p>
+    <w:p>
+      <w:pPr/>
+      <w:r>
+        <w:rPr>
+          <w:rFonts w:ascii="Times" w:hAnsi="Times" w:cs="Times"/>
+          <w:sz w:val="24"/>
+          <w:sz-cs w:val="24"/>
+        </w:rPr>
+        <w:t xml:space="preserve"/>
+      </w:r>
+    </w:p>
+    <w:p>
+      <w:pPr/>
+      <w:r>
+        <w:rPr>
+          <w:rFonts w:ascii="Times" w:hAnsi="Times" w:cs="Times"/>
+          <w:sz w:val="24"/>
+          <w:sz-cs w:val="24"/>
+        </w:rPr>
+        <w:t xml:space="preserve">Zwolnić pracownika</w:t>
+      </w:r>
+    </w:p>
+    <w:p>
+      <w:pPr/>
+      <w:r>
+        <w:rPr>
+          <w:rFonts w:ascii="Times" w:hAnsi="Times" w:cs="Times"/>
+          <w:sz w:val="24"/>
+          <w:sz-cs w:val="24"/>
+        </w:rPr>
+        <w:t xml:space="preserve"/>
+      </w:r>
+    </w:p>
+    <w:p>
+      <w:pPr/>
+      <w:r>
+        <w:rPr>
+          <w:rFonts w:ascii="Times" w:hAnsi="Times" w:cs="Times"/>
+          <w:sz w:val="24"/>
+          <w:sz-cs w:val="24"/>
+        </w:rPr>
+        <w:t xml:space="preserve"/>
+      </w:r>
+    </w:p>
+    <w:p>
+      <w:pPr/>
+      <w:r>
+        <w:rPr>
+          <w:rFonts w:ascii="Times" w:hAnsi="Times" w:cs="Times"/>
+          <w:sz w:val="24"/>
+          <w:sz-cs w:val="24"/>
+        </w:rPr>
+        <w:t xml:space="preserve"/>
+      </w:r>
+    </w:p>
+    <w:p>
+      <w:pPr/>
+      <w:r>
+        <w:rPr>
+          <w:rFonts w:ascii="Times" w:hAnsi="Times" w:cs="Times"/>
+          <w:sz w:val="24"/>
+          <w:sz-cs w:val="24"/>
+          <w:b/>
+        </w:rPr>
+        <w:t xml:space="preserve">Implementacja procesu rozmowy</w:t>
+      </w:r>
+      <w:r>
+        <w:rPr>
+          <w:rFonts w:ascii="Times" w:hAnsi="Times" w:cs="Times"/>
+          <w:sz w:val="24"/>
+          <w:sz-cs w:val="24"/>
+        </w:rPr>
+        <w:t xml:space="preserve"/>
       </w:r>
     </w:p>
     <w:p>

</xml_diff>

<commit_message>
Implemented arguments, added speech bubble images
</commit_message>
<xml_diff>
--- a/Dokumentacja.docx
+++ b/Dokumentacja.docx
@@ -2516,6 +2516,138 @@
           <w:sz-cs w:val="24"/>
         </w:rPr>
         <w:t xml:space="preserve"/>
+      </w:r>
+    </w:p>
+    <w:p>
+      <w:pPr/>
+      <w:r>
+        <w:rPr>
+          <w:rFonts w:ascii="Times" w:hAnsi="Times" w:cs="Times"/>
+          <w:sz w:val="24"/>
+          <w:sz-cs w:val="24"/>
+        </w:rPr>
+        <w:t xml:space="preserve"/>
+      </w:r>
+    </w:p>
+    <w:p>
+      <w:pPr/>
+      <w:r>
+        <w:rPr>
+          <w:rFonts w:ascii="Times" w:hAnsi="Times" w:cs="Times"/>
+          <w:sz w:val="24"/>
+          <w:sz-cs w:val="24"/>
+        </w:rPr>
+        <w:t xml:space="preserve">Efekt hover przy stawianiu pracownika w action_object</w:t>
+      </w:r>
+    </w:p>
+    <w:p>
+      <w:pPr/>
+      <w:r>
+        <w:rPr>
+          <w:rFonts w:ascii="Times" w:hAnsi="Times" w:cs="Times"/>
+          <w:sz w:val="24"/>
+          <w:sz-cs w:val="24"/>
+        </w:rPr>
+        <w:t xml:space="preserve"/>
+      </w:r>
+    </w:p>
+    <w:p>
+      <w:pPr/>
+      <w:r>
+        <w:rPr>
+          <w:rFonts w:ascii="Times" w:hAnsi="Times" w:cs="Times"/>
+          <w:sz w:val="24"/>
+          <w:sz-cs w:val="24"/>
+        </w:rPr>
+        <w:t xml:space="preserve">Kiedy pracownik jest chwytany, przy każdym action_object ukazywany jest hover dot</w:t>
+      </w:r>
+    </w:p>
+    <w:p>
+      <w:pPr/>
+      <w:r>
+        <w:rPr>
+          <w:rFonts w:ascii="Times" w:hAnsi="Times" w:cs="Times"/>
+          <w:sz w:val="24"/>
+          <w:sz-cs w:val="24"/>
+        </w:rPr>
+        <w:t xml:space="preserve">Hover dot to kółko które określa czy pracownik wszedł w kolizje z action_object</w:t>
+      </w:r>
+    </w:p>
+    <w:p>
+      <w:pPr/>
+      <w:r>
+        <w:rPr>
+          <w:rFonts w:ascii="Times" w:hAnsi="Times" w:cs="Times"/>
+          <w:sz w:val="24"/>
+          <w:sz-cs w:val="24"/>
+        </w:rPr>
+        <w:t xml:space="preserve"/>
+      </w:r>
+    </w:p>
+    <w:p>
+      <w:pPr/>
+      <w:r>
+        <w:rPr>
+          <w:rFonts w:ascii="Times" w:hAnsi="Times" w:cs="Times"/>
+          <w:sz w:val="24"/>
+          <w:sz-cs w:val="24"/>
+        </w:rPr>
+        <w:t xml:space="preserve">Kiedy pracownik nie jest w kolizji, kółko jest małe, szare</w:t>
+      </w:r>
+    </w:p>
+    <w:p>
+      <w:pPr/>
+      <w:r>
+        <w:rPr>
+          <w:rFonts w:ascii="Times" w:hAnsi="Times" w:cs="Times"/>
+          <w:sz w:val="24"/>
+          <w:sz-cs w:val="24"/>
+        </w:rPr>
+        <w:t xml:space="preserve">Kiedy wchodzi kółko się powiększa i jest jasne/białe/zielone</w:t>
+      </w:r>
+    </w:p>
+    <w:p>
+      <w:pPr/>
+      <w:r>
+        <w:rPr>
+          <w:rFonts w:ascii="Times" w:hAnsi="Times" w:cs="Times"/>
+          <w:sz w:val="24"/>
+          <w:sz-cs w:val="24"/>
+        </w:rPr>
+        <w:t xml:space="preserve"/>
+      </w:r>
+    </w:p>
+    <w:p>
+      <w:pPr/>
+      <w:r>
+        <w:rPr>
+          <w:rFonts w:ascii="Times" w:hAnsi="Times" w:cs="Times"/>
+          <w:sz w:val="24"/>
+          <w:sz-cs w:val="24"/>
+        </w:rPr>
+        <w:t xml:space="preserve">Kołko pojawia się dopiero w action obiektach wolnych albo przy pracownikach</w:t>
+      </w:r>
+    </w:p>
+    <w:p>
+      <w:pPr/>
+      <w:r>
+        <w:rPr>
+          <w:rFonts w:ascii="Times" w:hAnsi="Times" w:cs="Times"/>
+          <w:sz w:val="24"/>
+          <w:sz-cs w:val="24"/>
+        </w:rPr>
+        <w:t xml:space="preserve"/>
+      </w:r>
+    </w:p>
+    <w:p>
+      <w:pPr/>
+      <w:r>
+        <w:rPr>
+          <w:rFonts w:ascii="Times" w:hAnsi="Times" w:cs="Times"/>
+          <w:sz w:val="24"/>
+          <w:sz-cs w:val="24"/>
+        </w:rPr>
+        <w:t xml:space="preserve">Aby wejść w interakcje między pracownikami</w:t>
       </w:r>
     </w:p>
     <w:p>

</xml_diff>

<commit_message>
Introduce new interface displaying full emp statistics and reliationships - beta 1
</commit_message>
<xml_diff>
--- a/Dokumentacja.docx
+++ b/Dokumentacja.docx
@@ -2648,6 +2648,196 @@
           <w:sz-cs w:val="24"/>
         </w:rPr>
         <w:t xml:space="preserve">Aby wejść w interakcje między pracownikami</w:t>
+      </w:r>
+    </w:p>
+    <w:p>
+      <w:pPr/>
+      <w:r>
+        <w:rPr>
+          <w:rFonts w:ascii="Times" w:hAnsi="Times" w:cs="Times"/>
+          <w:sz w:val="24"/>
+          <w:sz-cs w:val="24"/>
+        </w:rPr>
+        <w:t xml:space="preserve"/>
+      </w:r>
+    </w:p>
+    <w:p>
+      <w:pPr/>
+      <w:r>
+        <w:rPr>
+          <w:rFonts w:ascii="Times" w:hAnsi="Times" w:cs="Times"/>
+          <w:sz w:val="24"/>
+          <w:sz-cs w:val="24"/>
+          <w:b/>
+        </w:rPr>
+        <w:t xml:space="preserve"/>
+      </w:r>
+    </w:p>
+    <w:p>
+      <w:pPr/>
+      <w:r>
+        <w:rPr>
+          <w:rFonts w:ascii="Times" w:hAnsi="Times" w:cs="Times"/>
+          <w:sz w:val="24"/>
+          <w:sz-cs w:val="24"/>
+          <w:b/>
+        </w:rPr>
+        <w:t xml:space="preserve">Interfejs statystyki pracownika</w:t>
+      </w:r>
+    </w:p>
+    <w:p>
+      <w:pPr/>
+      <w:r>
+        <w:rPr>
+          <w:rFonts w:ascii="Times" w:hAnsi="Times" w:cs="Times"/>
+          <w:sz w:val="24"/>
+          <w:sz-cs w:val="24"/>
+          <w:b/>
+        </w:rPr>
+        <w:t xml:space="preserve"/>
+      </w:r>
+    </w:p>
+    <w:p>
+      <w:pPr/>
+      <w:r>
+        <w:rPr>
+          <w:rFonts w:ascii="Times" w:hAnsi="Times" w:cs="Times"/>
+          <w:sz w:val="24"/>
+          <w:sz-cs w:val="24"/>
+        </w:rPr>
+        <w:t xml:space="preserve">Prawym przyciskiem naciskasz na pracownika.</w:t>
+      </w:r>
+    </w:p>
+    <w:p>
+      <w:pPr/>
+      <w:r>
+        <w:rPr>
+          <w:rFonts w:ascii="Times" w:hAnsi="Times" w:cs="Times"/>
+          <w:sz w:val="24"/>
+          <w:sz-cs w:val="24"/>
+        </w:rPr>
+        <w:t xml:space="preserve"/>
+      </w:r>
+    </w:p>
+    <w:p>
+      <w:pPr/>
+      <w:r>
+        <w:rPr>
+          <w:rFonts w:ascii="Times" w:hAnsi="Times" w:cs="Times"/>
+          <w:sz w:val="24"/>
+          <w:sz-cs w:val="24"/>
+        </w:rPr>
+        <w:t xml:space="preserve">Na środku ekranu pojawia się interfejs jego statystyk:</w:t>
+      </w:r>
+    </w:p>
+    <w:p>
+      <w:pPr/>
+      <w:r>
+        <w:rPr>
+          <w:rFonts w:ascii="Times" w:hAnsi="Times" w:cs="Times"/>
+          <w:sz w:val="24"/>
+          <w:sz-cs w:val="24"/>
+        </w:rPr>
+        <w:t xml:space="preserve">- imię</w:t>
+      </w:r>
+    </w:p>
+    <w:p>
+      <w:pPr/>
+      <w:r>
+        <w:rPr>
+          <w:rFonts w:ascii="Times" w:hAnsi="Times" w:cs="Times"/>
+          <w:sz w:val="24"/>
+          <w:sz-cs w:val="24"/>
+        </w:rPr>
+        <w:t xml:space="preserve">- ilość sprzedanych papierów i pieniędzy zarobionych</w:t>
+      </w:r>
+    </w:p>
+    <w:p>
+      <w:pPr/>
+      <w:r>
+        <w:rPr>
+          <w:rFonts w:ascii="Times" w:hAnsi="Times" w:cs="Times"/>
+          <w:sz w:val="24"/>
+          <w:sz-cs w:val="24"/>
+        </w:rPr>
+        <w:t xml:space="preserve">- dni zatrudnienia</w:t>
+      </w:r>
+    </w:p>
+    <w:p>
+      <w:pPr/>
+      <w:r>
+        <w:rPr>
+          <w:rFonts w:ascii="Times" w:hAnsi="Times" w:cs="Times"/>
+          <w:sz w:val="24"/>
+          <w:sz-cs w:val="24"/>
+        </w:rPr>
+        <w:t xml:space="preserve">- wypłata</w:t>
+      </w:r>
+    </w:p>
+    <w:p>
+      <w:pPr/>
+      <w:r>
+        <w:rPr>
+          <w:rFonts w:ascii="Times" w:hAnsi="Times" w:cs="Times"/>
+          <w:sz w:val="24"/>
+          <w:sz-cs w:val="24"/>
+        </w:rPr>
+        <w:t xml:space="preserve">- ilość papierów sprzedanych na godzinę</w:t>
+      </w:r>
+    </w:p>
+    <w:p>
+      <w:pPr/>
+      <w:r>
+        <w:rPr>
+          <w:rFonts w:ascii="Times" w:hAnsi="Times" w:cs="Times"/>
+          <w:sz w:val="24"/>
+          <w:sz-cs w:val="24"/>
+        </w:rPr>
+        <w:t xml:space="preserve">następna strona ot relacje z innymi pracownikami: </w:t>
+      </w:r>
+    </w:p>
+    <w:p>
+      <w:pPr/>
+      <w:r>
+        <w:rPr>
+          <w:rFonts w:ascii="Times" w:hAnsi="Times" w:cs="Times"/>
+          <w:sz w:val="24"/>
+          <w:sz-cs w:val="24"/>
+        </w:rPr>
+        <w:t xml:space="preserve">- imię pracownika i poziom relacji</w:t>
+      </w:r>
+    </w:p>
+    <w:p>
+      <w:pPr/>
+      <w:r>
+        <w:rPr>
+          <w:rFonts w:ascii="Times" w:hAnsi="Times" w:cs="Times"/>
+          <w:sz w:val="24"/>
+          <w:sz-cs w:val="24"/>
+        </w:rPr>
+        <w:t xml:space="preserve">- posortowane od najwyższej do najniższej</w:t>
+      </w:r>
+    </w:p>
+    <w:p>
+      <w:pPr/>
+      <w:r>
+        <w:rPr>
+          <w:rFonts w:ascii="Times" w:hAnsi="Times" w:cs="Times"/>
+          <w:sz w:val="24"/>
+          <w:sz-cs w:val="24"/>
+        </w:rPr>
+        <w:t xml:space="preserve">- scrollowac można przez listę znajomosci</w:t>
+      </w:r>
+    </w:p>
+    <w:p>
+      <w:pPr/>
+      <w:r>
+        <w:rPr>
+          <w:rFonts w:ascii="Times" w:hAnsi="Times" w:cs="Times"/>
+          <w:sz w:val="24"/>
+          <w:sz-cs w:val="24"/>
+        </w:rPr>
+        <w:t xml:space="preserve"/>
       </w:r>
     </w:p>
     <w:p>

</xml_diff>